<commit_message>
Fuera el cronograma: la sesion queda en tres bloques
Conceptos, ejemplos y el hacer. Se quitan los minutos de la diapositiva de
ruta, del taller y de la puesta en comun; las notas del docente pierden la
marca de reloj y el enunciado del taller pasa de minuto a minuto a cuatro
pasos numerados, con una nota de que recortar si el tiempo aprieta.

En la presentacion web desaparecen el reloj de sesion y los minutos del
indice; el cronometro del taller se queda, ajustable en tramos de cinco
minutos, porque el docente decide en el momento cuanto tiempo le queda.

Co-Authored-By: Claude Opus 5 <noreply@anthropic.com>
</commit_message>
<xml_diff>
--- a/fuentes/AREM_S3_Enunciado_Actividad_3_2.docx
+++ b/fuentes/AREM_S3_Enunciado_Actividad_3_2.docx
@@ -83,16 +83,7 @@
     </w:p>
     <w:p>
       <w:r>
-        <w:t xml:space="preserve">Es el único momento de trabajo en salas de la sesión: </w:t>
-      </w:r>
-      <w:r>
-        <w:rPr>
-          <w:b/>
-        </w:rPr>
-        <w:t>27 minutos</w:t>
-      </w:r>
-      <w:r>
-        <w:t>, en los grupos de la Actividad 3.2 (3 a 4 integrantes) y sobre su propio caso. Es el primer avance de la 3.2 que está en la plataforma, no un ejercicio aparte.</w:t>
+        <w:t>Es el único momento de trabajo en salas de la sesión, en los grupos de la Actividad 3.2 (3 a 4 integrantes) y sobre su propio caso. Es el primer avance de la 3.2 que está en la plataforma, no un ejercicio aparte. El docente anuncia al empezar cuánto tiempo hay y lo pone en el cronómetro.</w:t>
       </w:r>
     </w:p>
     <w:p>
@@ -462,7 +453,7 @@
         <w:pStyle w:val="Heading1"/>
       </w:pPr>
       <w:r>
-        <w:t>2. El taller, minuto a minuto</w:t>
+        <w:t>2. El taller, paso a paso</w:t>
       </w:r>
     </w:p>
     <w:tbl>
@@ -490,7 +481,7 @@
         </w:trPr>
         <w:tc>
           <w:tcPr>
-            <w:tcW w:type="dxa" w:w="907"/>
+            <w:tcW w:type="dxa" w:w="680"/>
             <w:shd w:val="clear" w:color="auto" w:fill="DCE6F2"/>
           </w:tcPr>
           <w:p>
@@ -503,13 +494,13 @@
                 <w:b/>
                 <w:sz w:val="19"/>
               </w:rPr>
-              <w:t>Minuto</w:t>
+              <w:t>Paso</w:t>
             </w:r>
           </w:p>
         </w:tc>
         <w:tc>
           <w:tcPr>
-            <w:tcW w:type="dxa" w:w="6009"/>
+            <w:tcW w:type="dxa" w:w="6236"/>
             <w:shd w:val="clear" w:color="auto" w:fill="DCE6F2"/>
           </w:tcPr>
           <w:p>
@@ -549,7 +540,7 @@
       <w:tr>
         <w:tc>
           <w:tcPr>
-            <w:tcW w:type="dxa" w:w="907"/>
+            <w:tcW w:type="dxa" w:w="680"/>
           </w:tcPr>
           <w:p>
             <w:pPr>
@@ -560,13 +551,13 @@
               <w:rPr>
                 <w:sz w:val="19"/>
               </w:rPr>
-              <w:t>0 a 5</w:t>
+              <w:t>1</w:t>
             </w:r>
           </w:p>
         </w:tc>
         <w:tc>
           <w:tcPr>
-            <w:tcW w:type="dxa" w:w="6009"/>
+            <w:tcW w:type="dxa" w:w="6236"/>
           </w:tcPr>
           <w:p>
             <w:pPr>
@@ -609,7 +600,7 @@
       <w:tr>
         <w:tc>
           <w:tcPr>
-            <w:tcW w:type="dxa" w:w="907"/>
+            <w:tcW w:type="dxa" w:w="680"/>
           </w:tcPr>
           <w:p>
             <w:pPr>
@@ -620,13 +611,13 @@
               <w:rPr>
                 <w:sz w:val="19"/>
               </w:rPr>
-              <w:t>5 a 12</w:t>
+              <w:t>2</w:t>
             </w:r>
           </w:p>
         </w:tc>
         <w:tc>
           <w:tcPr>
-            <w:tcW w:type="dxa" w:w="6009"/>
+            <w:tcW w:type="dxa" w:w="6236"/>
           </w:tcPr>
           <w:p>
             <w:pPr>
@@ -669,7 +660,7 @@
       <w:tr>
         <w:tc>
           <w:tcPr>
-            <w:tcW w:type="dxa" w:w="907"/>
+            <w:tcW w:type="dxa" w:w="680"/>
           </w:tcPr>
           <w:p>
             <w:pPr>
@@ -680,13 +671,13 @@
               <w:rPr>
                 <w:sz w:val="19"/>
               </w:rPr>
-              <w:t>12 a 20</w:t>
+              <w:t>3</w:t>
             </w:r>
           </w:p>
         </w:tc>
         <w:tc>
           <w:tcPr>
-            <w:tcW w:type="dxa" w:w="6009"/>
+            <w:tcW w:type="dxa" w:w="6236"/>
           </w:tcPr>
           <w:p>
             <w:pPr>
@@ -729,7 +720,7 @@
       <w:tr>
         <w:tc>
           <w:tcPr>
-            <w:tcW w:type="dxa" w:w="907"/>
+            <w:tcW w:type="dxa" w:w="680"/>
           </w:tcPr>
           <w:p>
             <w:pPr>
@@ -740,13 +731,13 @@
               <w:rPr>
                 <w:sz w:val="19"/>
               </w:rPr>
-              <w:t>20 a 27</w:t>
+              <w:t>4</w:t>
             </w:r>
           </w:p>
         </w:tc>
         <w:tc>
           <w:tcPr>
-            <w:tcW w:type="dxa" w:w="6009"/>
+            <w:tcW w:type="dxa" w:w="6236"/>
           </w:tcPr>
           <w:p>
             <w:pPr>
@@ -809,7 +800,7 @@
         <w:t>Compliance Review</w:t>
       </w:r>
       <w:r>
-        <w:t xml:space="preserve"> para el bloque de 12 a 20 —no deja registrar una excepción sin vencimiento— y </w:t>
+        <w:t xml:space="preserve"> para el paso 3 —no deja registrar una excepción sin vencimiento— y </w:t>
       </w:r>
       <w:r>
         <w:rPr>
@@ -818,7 +809,7 @@
         <w:t>Diseñador de ARB</w:t>
       </w:r>
       <w:r>
-        <w:t xml:space="preserve"> para el de 20 a 27, que calcula solo el porcentaje de la capacidad. Las dos tienen el botón «Empezar con el caso del grupo».</w:t>
+        <w:t xml:space="preserve"> para el paso 4, que calcula solo el porcentaje de la capacidad. Las dos tienen el botón «Empezar con el caso del grupo».</w:t>
       </w:r>
     </w:p>
     <w:p>
@@ -1778,6 +1769,49 @@
         <w:spacing w:after="40"/>
       </w:pPr>
     </w:p>
+    <w:tbl>
+      <w:tblPr>
+        <w:tblW w:type="auto" w:w="0"/>
+        <w:tblLook w:firstColumn="1" w:firstRow="1" w:lastColumn="0" w:lastRow="0" w:noHBand="0" w:noVBand="1" w:val="04A0"/>
+      </w:tblPr>
+      <w:tblGrid>
+        <w:gridCol w:w="9406"/>
+      </w:tblGrid>
+      <w:tr>
+        <w:tc>
+          <w:tcPr>
+            <w:tcW w:type="dxa" w:w="9406"/>
+            <w:shd w:val="clear" w:color="auto" w:fill="EEF3FA"/>
+            <w:tcBorders>
+              <w:top w:val="nil"/>
+              <w:bottom w:val="nil"/>
+              <w:right w:val="nil"/>
+              <w:left w:val="single" w:sz="24" w:color="C2622C"/>
+            </w:tcBorders>
+          </w:tcPr>
+          <w:p>
+            <w:r>
+              <w:rPr>
+                <w:b/>
+                <w:sz w:val="20"/>
+              </w:rPr>
+              <w:t>Si el tiempo aprieta.</w:t>
+            </w:r>
+            <w:r>
+              <w:rPr>
+                <w:sz w:val="20"/>
+              </w:rPr>
+              <w:t xml:space="preserve"> Los pasos 1 y 2 no se negocian: sin episodio y sin principio no hay de dónde sacar lo demás. El paso 3 puede quedar en la pregunta y el dictamen, sin la excepción. El paso 4 puede reducirse a nombrar las sillas, y el cálculo de horas se termina fuera de clase.</w:t>
+            </w:r>
+          </w:p>
+        </w:tc>
+      </w:tr>
+    </w:tbl>
+    <w:p>
+      <w:pPr>
+        <w:spacing w:after="40"/>
+      </w:pPr>
+    </w:p>
     <w:p>
       <w:pPr>
         <w:pStyle w:val="Heading1"/>

</xml_diff>